<commit_message>
Rewrite the Phase 3 film around the real capstone.
Capstone is now deploy-on-any-rig plus a short commissioning interview, not a hydraulic plant. The spoken script is an editable file, and the stills are Veritasium/3Blue1Brown-style diagrams you Ken-Burns in CapCut.

Co-authored-by: Chintan Dedhia <shadybrook@users.noreply.github.com>
</commit_message>
<xml_diff>
--- a/deliverables/CertaRig_Phase3_Submission_Film_Script.docx
+++ b/deliverables/CertaRig_Phase3_Submission_Film_Script.docx
@@ -76,93 +76,186 @@
       <w:r>
         <w:rPr>
           <w:rFonts w:ascii="Arial" w:hAnsi="Arial"/>
+          <w:sz w:val="22"/>
+        </w:rPr>
+        <w:t xml:space="preserve">This is the voiceover you actually record. Change any line under </w:t>
+      </w:r>
+      <w:r>
+        <w:rPr>
+          <w:rFonts w:ascii="Arial" w:hAnsi="Arial"/>
           <w:b/>
           <w:sz w:val="22"/>
         </w:rPr>
-        <w:t>Working title:</w:t>
+        <w:t>Say this</w:t>
       </w:r>
       <w:r>
         <w:rPr>
           <w:rFonts w:ascii="Arial" w:hAnsi="Arial"/>
           <w:sz w:val="22"/>
         </w:rPr>
-        <w:t xml:space="preserve"> What is CertaRig?</w:t>
+        <w:t xml:space="preserve">. Leave </w:t>
+      </w:r>
+      <w:r>
+        <w:rPr>
+          <w:rFonts w:ascii="Arial" w:hAnsi="Arial"/>
+          <w:b/>
+          <w:sz w:val="22"/>
+        </w:rPr>
+        <w:t>Keep these facts</w:t>
+      </w:r>
+      <w:r>
+        <w:rPr>
+          <w:rFonts w:ascii="Arial" w:hAnsi="Arial"/>
+          <w:sz w:val="22"/>
+        </w:rPr>
+        <w:t xml:space="preserve"> alone unless a number is wrong.</w:t>
       </w:r>
     </w:p>
     <w:p>
       <w:r>
         <w:rPr>
           <w:rFonts w:ascii="Arial" w:hAnsi="Arial"/>
-          <w:b/>
           <w:sz w:val="22"/>
         </w:rPr>
-        <w:t>Presenter card:</w:t>
+        <w:t>How to edit:</w:t>
+      </w:r>
+    </w:p>
+    <w:p>
+      <w:pPr>
+        <w:ind w:left="403" w:hanging="403"/>
+      </w:pPr>
+      <w:r>
+        <w:rPr>
+          <w:rFonts w:ascii="Arial" w:hAnsi="Arial"/>
+          <w:b/>
+          <w:color w:val="1F5E4C"/>
+          <w:sz w:val="22"/>
+        </w:rPr>
+        <w:t xml:space="preserve">1.  </w:t>
       </w:r>
       <w:r>
         <w:rPr>
           <w:rFonts w:ascii="Arial" w:hAnsi="Arial"/>
           <w:sz w:val="22"/>
         </w:rPr>
-        <w:t xml:space="preserve"> Chintan Dedhia</w:t>
+        <w:t xml:space="preserve">Open this file, or open </w:t>
+      </w:r>
+      <w:r>
+        <w:rPr>
+          <w:rFonts w:ascii="Courier New" w:hAnsi="Courier New"/>
+          <w:color w:val="172523"/>
+          <w:sz w:val="19"/>
+        </w:rPr>
+        <w:t>deliverables/CertaRig_Phase3_Submission_Film_Script.docx</w:t>
+      </w:r>
+      <w:r>
+        <w:rPr>
+          <w:rFonts w:ascii="Arial" w:hAnsi="Arial"/>
+          <w:sz w:val="22"/>
+        </w:rPr>
+        <w:t xml:space="preserve"> in Word / Google Docs.</w:t>
+      </w:r>
+    </w:p>
+    <w:p>
+      <w:pPr>
+        <w:ind w:left="403" w:hanging="403"/>
+      </w:pPr>
+      <w:r>
+        <w:rPr>
+          <w:rFonts w:ascii="Arial" w:hAnsi="Arial"/>
+          <w:b/>
+          <w:color w:val="1F5E4C"/>
+          <w:sz w:val="22"/>
+        </w:rPr>
+        <w:t xml:space="preserve">2.  </w:t>
+      </w:r>
+      <w:r>
+        <w:rPr>
+          <w:rFonts w:ascii="Arial" w:hAnsi="Arial"/>
+          <w:sz w:val="22"/>
+        </w:rPr>
+        <w:t xml:space="preserve">Rewrite </w:t>
+      </w:r>
+      <w:r>
+        <w:rPr>
+          <w:rFonts w:ascii="Arial" w:hAnsi="Arial"/>
+          <w:b/>
+          <w:sz w:val="22"/>
+        </w:rPr>
+        <w:t>Say this</w:t>
+      </w:r>
+      <w:r>
+        <w:rPr>
+          <w:rFonts w:ascii="Arial" w:hAnsi="Arial"/>
+          <w:sz w:val="22"/>
+        </w:rPr>
+        <w:t xml:space="preserve"> in your own voice. Shorter is fine.</w:t>
+      </w:r>
+    </w:p>
+    <w:p>
+      <w:pPr>
+        <w:ind w:left="403" w:hanging="403"/>
+      </w:pPr>
+      <w:r>
+        <w:rPr>
+          <w:rFonts w:ascii="Arial" w:hAnsi="Arial"/>
+          <w:b/>
+          <w:color w:val="1F5E4C"/>
+          <w:sz w:val="22"/>
+        </w:rPr>
+        <w:t xml:space="preserve">3.  </w:t>
+      </w:r>
+      <w:r>
+        <w:rPr>
+          <w:rFonts w:ascii="Arial" w:hAnsi="Arial"/>
+          <w:sz w:val="22"/>
+        </w:rPr>
+        <w:t xml:space="preserve">Do not change the </w:t>
+      </w:r>
+      <w:r>
+        <w:rPr>
+          <w:rFonts w:ascii="Arial" w:hAnsi="Arial"/>
+          <w:b/>
+          <w:sz w:val="22"/>
+        </w:rPr>
+        <w:t>Keep these facts</w:t>
+      </w:r>
+      <w:r>
+        <w:rPr>
+          <w:rFonts w:ascii="Arial" w:hAnsi="Arial"/>
+          <w:sz w:val="22"/>
+        </w:rPr>
+        <w:t xml:space="preserve"> numbers (4.2 bar, 15 L/min, 12 Sep peaks, Fake on the bench).</w:t>
+      </w:r>
+    </w:p>
+    <w:p>
+      <w:pPr>
+        <w:ind w:left="403" w:hanging="403"/>
+      </w:pPr>
+      <w:r>
+        <w:rPr>
+          <w:rFonts w:ascii="Arial" w:hAnsi="Arial"/>
+          <w:b/>
+          <w:color w:val="1F5E4C"/>
+          <w:sz w:val="22"/>
+        </w:rPr>
+        <w:t xml:space="preserve">4.  </w:t>
+      </w:r>
+      <w:r>
+        <w:rPr>
+          <w:rFonts w:ascii="Arial" w:hAnsi="Arial"/>
+          <w:sz w:val="22"/>
+        </w:rPr>
+        <w:t>Tell me what you changed if you want stills and captions regenerated.</w:t>
       </w:r>
     </w:p>
     <w:p>
       <w:r>
         <w:rPr>
           <w:rFonts w:ascii="Arial" w:hAnsi="Arial"/>
-          <w:b/>
           <w:sz w:val="22"/>
         </w:rPr>
-        <w:t>Target duration:</w:t>
-      </w:r>
-      <w:r>
-        <w:rPr>
-          <w:rFonts w:ascii="Arial" w:hAnsi="Arial"/>
-          <w:sz w:val="22"/>
-        </w:rPr>
-        <w:t xml:space="preserve"> 11:40 to 12:10</w:t>
-      </w:r>
-    </w:p>
-    <w:p>
-      <w:r>
-        <w:rPr>
-          <w:rFonts w:ascii="Arial" w:hAnsi="Arial"/>
-          <w:b/>
-          <w:sz w:val="22"/>
-        </w:rPr>
-        <w:t>Spoken rate:</w:t>
-      </w:r>
-      <w:r>
-        <w:rPr>
-          <w:rFonts w:ascii="Arial" w:hAnsi="Arial"/>
-          <w:sz w:val="22"/>
-        </w:rPr>
-        <w:t xml:space="preserve"> about 140 words per minute</w:t>
-      </w:r>
-    </w:p>
-    <w:p>
-      <w:r>
-        <w:rPr>
-          <w:rFonts w:ascii="Arial" w:hAnsi="Arial"/>
-          <w:b/>
-          <w:sz w:val="22"/>
-        </w:rPr>
-        <w:t>Format:</w:t>
-      </w:r>
-      <w:r>
-        <w:rPr>
-          <w:rFonts w:ascii="Arial" w:hAnsi="Arial"/>
-          <w:sz w:val="22"/>
-        </w:rPr>
-        <w:t xml:space="preserve"> Voiceover, illustrated stills, architecture cards, then a stitched product walkthrough. No talking-head required. Grammar inspired by the classmate Curastra demo, not copied from it.</w:t>
-      </w:r>
-    </w:p>
-    <w:p>
-      <w:pPr>
-        <w:pStyle w:val="Heading1"/>
-      </w:pPr>
-      <w:r>
-        <w:t>Production grammar</w:t>
+        <w:t>Visual grammar (Veritasium + 3Blue1Brown, not a product ad):</w:t>
       </w:r>
     </w:p>
     <w:p>
@@ -174,7 +267,7 @@
           <w:rFonts w:ascii="Arial" w:hAnsi="Arial"/>
           <w:sz w:val="22"/>
         </w:rPr>
-        <w:t>White title cards. Flat illustrated scenes for the problem. One architecture diagram, revealed in pieces. Then the real UI.</w:t>
+        <w:t>One idea on screen at a time.</w:t>
       </w:r>
     </w:p>
     <w:p>
@@ -186,7 +279,7 @@
           <w:rFonts w:ascii="Arial" w:hAnsi="Arial"/>
           <w:sz w:val="22"/>
         </w:rPr>
-        <w:t>Safety colours stay consistent: blue for observation, green for permitted, red for forced safe, gold for reset required.</w:t>
+        <w:t>A question, then a demonstration, then what it means.</w:t>
       </w:r>
     </w:p>
     <w:p>
@@ -198,7 +291,7 @@
           <w:rFonts w:ascii="Arial" w:hAnsi="Arial"/>
           <w:sz w:val="22"/>
         </w:rPr>
-        <w:t>Define every abbreviation on first use: analog to digital converter, emergency stop, hardware in the loop, general-purpose input/output.</w:t>
+        <w:t>Diagrams, not talking-head lectures. A face at the open and close is optional.</w:t>
       </w:r>
     </w:p>
     <w:p>
@@ -210,31 +303,7 @@
           <w:rFonts w:ascii="Arial" w:hAnsi="Arial"/>
           <w:sz w:val="22"/>
         </w:rPr>
-        <w:t>Never call a simulated trace a hardware trace. Never call a GPIO command transition a measured relay response.</w:t>
-      </w:r>
-    </w:p>
-    <w:p>
-      <w:pPr>
-        <w:pStyle w:val="ListBullet"/>
-      </w:pPr>
-      <w:r>
-        <w:rPr>
-          <w:rFonts w:ascii="Arial" w:hAnsi="Arial"/>
-          <w:sz w:val="22"/>
-        </w:rPr>
-        <w:t>Never say Grok, Claude, or GPT tripped the relay.</w:t>
-      </w:r>
-    </w:p>
-    <w:p>
-      <w:pPr>
-        <w:pStyle w:val="ListBullet"/>
-      </w:pPr>
-      <w:r>
-        <w:rPr>
-          <w:rFonts w:ascii="Arial" w:hAnsi="Arial"/>
-          <w:sz w:val="22"/>
-        </w:rPr>
-        <w:t xml:space="preserve">On first use of a live clip, label the surface on screen: </w:t>
+        <w:t xml:space="preserve">Stills in </w:t>
       </w:r>
       <w:r>
         <w:rPr>
@@ -242,44 +311,14 @@
           <w:color w:val="172523"/>
           <w:sz w:val="19"/>
         </w:rPr>
-        <w:t>Phase 3 dashboard · observe only</w:t>
+        <w:t>stills/</w:t>
       </w:r>
       <w:r>
         <w:rPr>
           <w:rFonts w:ascii="Arial" w:hAnsi="Arial"/>
           <w:sz w:val="22"/>
         </w:rPr>
-        <w:t xml:space="preserve"> or </w:t>
-      </w:r>
-      <w:r>
-        <w:rPr>
-          <w:rFonts w:ascii="Courier New" w:hAnsi="Courier New"/>
-          <w:color w:val="172523"/>
-          <w:sz w:val="19"/>
-        </w:rPr>
-        <w:t>Studio · simulator</w:t>
-      </w:r>
-      <w:r>
-        <w:rPr>
-          <w:rFonts w:ascii="Arial" w:hAnsi="Arial"/>
-          <w:sz w:val="22"/>
-        </w:rPr>
-        <w:t xml:space="preserve"> or </w:t>
-      </w:r>
-      <w:r>
-        <w:rPr>
-          <w:rFonts w:ascii="Courier New" w:hAnsi="Courier New"/>
-          <w:color w:val="172523"/>
-          <w:sz w:val="19"/>
-        </w:rPr>
-        <w:t>Studio · Raspberry Pi sidecar</w:t>
-      </w:r>
-      <w:r>
-        <w:rPr>
-          <w:rFonts w:ascii="Arial" w:hAnsi="Arial"/>
-          <w:sz w:val="22"/>
-        </w:rPr>
-        <w:t>.</w:t>
+        <w:t xml:space="preserve"> are the “animation.” Ken-Burns them. True motion graphics are not required.</w:t>
       </w:r>
     </w:p>
     <w:p>
@@ -288,7 +327,16 @@
           <w:rFonts w:ascii="Arial" w:hAnsi="Arial"/>
           <w:sz w:val="22"/>
         </w:rPr>
-        <w:t>Word count of the spoken track is about 1,650 words, which is just under twelve minutes at 140 words per minute. Hold on demo screens when the operator is clicking; do not rush the 7:45 to 11:00 block.</w:t>
+        <w:t>Capstone (this is the product, not a hydraulic plant):</w:t>
+      </w:r>
+    </w:p>
+    <w:p>
+      <w:r>
+        <w:rPr>
+          <w:rFonts w:ascii="Arial" w:hAnsi="Arial"/>
+          <w:sz w:val="22"/>
+        </w:rPr>
+        <w:t>CertaRig deploys as an agentic test-operations layer on *someone else’s* rig. A short commissioning interview maps protocols, connections, pins, and components. A human still applies that map. The kernel still owns the output. That interview is designed, not built yet. Say so.</w:t>
       </w:r>
     </w:p>
     <w:p>
@@ -305,7 +353,7 @@
         <w:pStyle w:val="Heading1"/>
       </w:pPr>
       <w:r>
-        <w:t>0:00 to 0:20 — Title</w:t>
+        <w:t>0:00–0:20  Title</w:t>
       </w:r>
     </w:p>
     <w:p>
@@ -332,12 +380,22 @@
         </w:rPr>
         <w:t>stills/00_title.png</w:t>
       </w:r>
+    </w:p>
+    <w:p>
+      <w:r>
+        <w:rPr>
+          <w:rFonts w:ascii="Arial" w:hAnsi="Arial"/>
+          <w:b/>
+          <w:sz w:val="22"/>
+        </w:rPr>
+        <w:t>Optional:</w:t>
+      </w:r>
       <w:r>
         <w:rPr>
           <w:rFonts w:ascii="Arial" w:hAnsi="Arial"/>
           <w:sz w:val="22"/>
         </w:rPr>
-        <w:t>. Hold three silent seconds, then Ken-Burns a slow push-in.</w:t>
+        <w:t xml:space="preserve"> 8 seconds of you on camera instead of the title card.</w:t>
       </w:r>
     </w:p>
     <w:p>
@@ -347,7 +405,7 @@
           <w:b/>
           <w:sz w:val="22"/>
         </w:rPr>
-        <w:t>Narration:</w:t>
+        <w:t>Say this:</w:t>
       </w:r>
     </w:p>
     <w:p>
@@ -357,56 +415,6 @@
           <w:sz w:val="22"/>
         </w:rPr>
         <w:t>This is CertaRig. A test-operations platform where an AI can ask, and a deterministic kernel is the only thing allowed to say yes.</w:t>
-      </w:r>
-    </w:p>
-    <w:p>
-      <w:r>
-        <w:rPr>
-          <w:rFonts w:ascii="Arial" w:hAnsi="Arial"/>
-          <w:b/>
-          <w:sz w:val="22"/>
-        </w:rPr>
-        <w:t>On screen:</w:t>
-      </w:r>
-      <w:r>
-        <w:rPr>
-          <w:rFonts w:ascii="Arial" w:hAnsi="Arial"/>
-          <w:sz w:val="22"/>
-        </w:rPr>
-        <w:t xml:space="preserve"> </w:t>
-      </w:r>
-      <w:r>
-        <w:rPr>
-          <w:rFonts w:ascii="Courier New" w:hAnsi="Courier New"/>
-          <w:color w:val="172523"/>
-          <w:sz w:val="19"/>
-        </w:rPr>
-        <w:t>What is CertaRig?</w:t>
-      </w:r>
-    </w:p>
-    <w:p>
-      <w:r>
-        <w:rPr>
-          <w:rFonts w:ascii="Arial" w:hAnsi="Arial"/>
-          <w:b/>
-          <w:sz w:val="22"/>
-        </w:rPr>
-        <w:t>Lower third from 0:08:</w:t>
-      </w:r>
-      <w:r>
-        <w:rPr>
-          <w:rFonts w:ascii="Arial" w:hAnsi="Arial"/>
-          <w:sz w:val="22"/>
-        </w:rPr>
-        <w:t xml:space="preserve"> </w:t>
-      </w:r>
-      <w:r>
-        <w:rPr>
-          <w:rFonts w:ascii="Courier New" w:hAnsi="Courier New"/>
-          <w:color w:val="172523"/>
-          <w:sz w:val="19"/>
-        </w:rPr>
-        <w:t>Presented by Chintan Dedhia</w:t>
       </w:r>
     </w:p>
     <w:p>
@@ -423,7 +431,7 @@
         <w:pStyle w:val="Heading1"/>
       </w:pPr>
       <w:r>
-        <w:t>0:20 to 1:30 — The problem</w:t>
+        <w:t>0:20–1:30  The question</w:t>
       </w:r>
     </w:p>
     <w:p>
@@ -455,7 +463,7 @@
           <w:rFonts w:ascii="Arial" w:hAnsi="Arial"/>
           <w:sz w:val="22"/>
         </w:rPr>
-        <w:t xml:space="preserve"> for the operator and clipboard. Cut stock B-roll of a test cell, a pressure gauge, and a PLC cabinet from the search list in [capture-and-edit.md](capture-and-edit.md). Return to </w:t>
+        <w:t xml:space="preserve">, then </w:t>
       </w:r>
       <w:r>
         <w:rPr>
@@ -465,12 +473,22 @@
         </w:rPr>
         <w:t>stills/02_problem_relay.png</w:t>
       </w:r>
+    </w:p>
+    <w:p>
+      <w:r>
+        <w:rPr>
+          <w:rFonts w:ascii="Arial" w:hAnsi="Arial"/>
+          <w:b/>
+          <w:sz w:val="22"/>
+        </w:rPr>
+        <w:t>3B1B move:</w:t>
+      </w:r>
       <w:r>
         <w:rPr>
           <w:rFonts w:ascii="Arial" w:hAnsi="Arial"/>
           <w:sz w:val="22"/>
         </w:rPr>
-        <w:t xml:space="preserve"> on the last two sentences.</w:t>
+        <w:t xml:space="preserve"> language approaches a number line and stops.</w:t>
       </w:r>
     </w:p>
     <w:p>
@@ -480,7 +498,7 @@
           <w:b/>
           <w:sz w:val="22"/>
         </w:rPr>
-        <w:t>Narration:</w:t>
+        <w:t>Say this:</w:t>
       </w:r>
     </w:p>
     <w:p>
@@ -544,22 +562,14 @@
           <w:b/>
           <w:sz w:val="22"/>
         </w:rPr>
-        <w:t>On screen, last beat:</w:t>
+        <w:t>Keep these facts:</w:t>
       </w:r>
       <w:r>
         <w:rPr>
           <w:rFonts w:ascii="Arial" w:hAnsi="Arial"/>
           <w:sz w:val="22"/>
         </w:rPr>
-        <w:t xml:space="preserve"> </w:t>
-      </w:r>
-      <w:r>
-        <w:rPr>
-          <w:rFonts w:ascii="Courier New" w:hAnsi="Courier New"/>
-          <w:color w:val="172523"/>
-          <w:sz w:val="19"/>
-        </w:rPr>
-        <w:t>Who is allowed to energize the output?</w:t>
+        <w:t xml:space="preserve"> 4.2 bar and 15 L/min are the dry-bench guardrails.</w:t>
       </w:r>
     </w:p>
     <w:p>
@@ -576,7 +586,7 @@
         <w:pStyle w:val="Heading1"/>
       </w:pPr>
       <w:r>
-        <w:t>1:30 to 2:20 — What CertaRig is</w:t>
+        <w:t>1:30–2:20  Split the jobs</w:t>
       </w:r>
     </w:p>
     <w:p>
@@ -608,7 +618,7 @@
           <w:rFonts w:ascii="Arial" w:hAnsi="Arial"/>
           <w:sz w:val="22"/>
         </w:rPr>
-        <w:t>. Reveal one block at a time: Operator and Studio, then Agent, then Kernel, then Rig.</w:t>
+        <w:t xml:space="preserve"> — reveal Operator, Agent, Kernel, Rig one block at a time.</w:t>
       </w:r>
     </w:p>
     <w:p>
@@ -618,7 +628,7 @@
           <w:b/>
           <w:sz w:val="22"/>
         </w:rPr>
-        <w:t>Narration:</w:t>
+        <w:t>Say this:</w:t>
       </w:r>
     </w:p>
     <w:p>
@@ -679,31 +689,6 @@
       <w:r>
         <w:rPr>
           <w:rFonts w:ascii="Arial" w:hAnsi="Arial"/>
-          <w:b/>
-          <w:sz w:val="22"/>
-        </w:rPr>
-        <w:t>On screen:</w:t>
-      </w:r>
-      <w:r>
-        <w:rPr>
-          <w:rFonts w:ascii="Arial" w:hAnsi="Arial"/>
-          <w:sz w:val="22"/>
-        </w:rPr>
-        <w:t xml:space="preserve"> </w:t>
-      </w:r>
-      <w:r>
-        <w:rPr>
-          <w:rFonts w:ascii="Courier New" w:hAnsi="Courier New"/>
-          <w:color w:val="172523"/>
-          <w:sz w:val="19"/>
-        </w:rPr>
-        <w:t>Agent interprets. Kernel decides. Evidence explains.</w:t>
-      </w:r>
-    </w:p>
-    <w:p>
-      <w:r>
-        <w:rPr>
-          <w:rFonts w:ascii="Arial" w:hAnsi="Arial"/>
           <w:sz w:val="22"/>
         </w:rPr>
         <w:t>---</w:t>
@@ -714,7 +699,7 @@
         <w:pStyle w:val="Heading1"/>
       </w:pPr>
       <w:r>
-        <w:t>2:20 to 3:20 — Who is the end customer</w:t>
+        <w:t>2:20–3:20  Who pays / who uses it</w:t>
       </w:r>
     </w:p>
     <w:p>
@@ -746,7 +731,7 @@
           <w:rFonts w:ascii="Arial" w:hAnsi="Arial"/>
           <w:sz w:val="22"/>
         </w:rPr>
-        <w:t xml:space="preserve">, then a slow pan across </w:t>
+        <w:t xml:space="preserve">, then </w:t>
       </w:r>
       <w:r>
         <w:rPr>
@@ -756,13 +741,6 @@
         </w:rPr>
         <w:t>stills/04_industries_hint.png</w:t>
       </w:r>
-      <w:r>
-        <w:rPr>
-          <w:rFonts w:ascii="Arial" w:hAnsi="Arial"/>
-          <w:sz w:val="22"/>
-        </w:rPr>
-        <w:t>.</w:t>
-      </w:r>
     </w:p>
     <w:p>
       <w:r>
@@ -771,7 +749,7 @@
           <w:b/>
           <w:sz w:val="22"/>
         </w:rPr>
-        <w:t>Narration:</w:t>
+        <w:t>Say this:</w:t>
       </w:r>
     </w:p>
     <w:p>
@@ -816,7 +794,7 @@
           <w:rFonts w:ascii="Arial" w:hAnsi="Arial"/>
           <w:sz w:val="22"/>
         </w:rPr>
-        <w:t>We are not claiming that an agent can look at a photograph of an unknown machine and take control. That is not proven, and it is not where the value is yet.</w:t>
+        <w:t>We are not claiming that an agent can look at a photograph of an unknown machine and take control. That is not proven.</w:t>
       </w:r>
     </w:p>
     <w:p>
@@ -825,32 +803,7 @@
           <w:rFonts w:ascii="Arial" w:hAnsi="Arial"/>
           <w:sz w:val="22"/>
         </w:rPr>
-        <w:t>The product is agent-guided commissioning and test operations for a mapped rig, with inspectable evidence.</w:t>
-      </w:r>
-    </w:p>
-    <w:p>
-      <w:r>
-        <w:rPr>
-          <w:rFonts w:ascii="Arial" w:hAnsi="Arial"/>
-          <w:b/>
-          <w:sz w:val="22"/>
-        </w:rPr>
-        <w:t>On screen:</w:t>
-      </w:r>
-      <w:r>
-        <w:rPr>
-          <w:rFonts w:ascii="Arial" w:hAnsi="Arial"/>
-          <w:sz w:val="22"/>
-        </w:rPr>
-        <w:t xml:space="preserve"> </w:t>
-      </w:r>
-      <w:r>
-        <w:rPr>
-          <w:rFonts w:ascii="Courier New" w:hAnsi="Courier New"/>
-          <w:color w:val="172523"/>
-          <w:sz w:val="19"/>
-        </w:rPr>
-        <w:t>Mapped rigs. Not unknown machines.</w:t>
+        <w:t>The product is an agentic system you deploy onto a mapped rig, with inspectable evidence.</w:t>
       </w:r>
     </w:p>
     <w:p>
@@ -867,7 +820,7 @@
         <w:pStyle w:val="Heading1"/>
       </w:pPr>
       <w:r>
-        <w:t>3:20 to 4:20 — Growing into industries</w:t>
+        <w:t>3:20–4:20  Same kernel, different buses</w:t>
       </w:r>
     </w:p>
     <w:p>
@@ -899,7 +852,7 @@
           <w:rFonts w:ascii="Arial" w:hAnsi="Arial"/>
           <w:sz w:val="22"/>
         </w:rPr>
-        <w:t>. Zoom along the row. Optional stock cutaways of a factory HMI, a motor-control cabinet, and an automotive bench.</w:t>
+        <w:t xml:space="preserve"> — pan across the row.</w:t>
       </w:r>
     </w:p>
     <w:p>
@@ -909,7 +862,7 @@
           <w:b/>
           <w:sz w:val="22"/>
         </w:rPr>
-        <w:t>Narration:</w:t>
+        <w:t>Say this:</w:t>
       </w:r>
     </w:p>
     <w:p>
@@ -945,32 +898,7 @@
           <w:rFonts w:ascii="Arial" w:hAnsi="Arial"/>
           <w:sz w:val="22"/>
         </w:rPr>
-        <w:t>That is how this grows. Not by giving the model more authority, but by letting more industries plug the same safety kernel into the buses they already have.</w:t>
-      </w:r>
-    </w:p>
-    <w:p>
-      <w:r>
-        <w:rPr>
-          <w:rFonts w:ascii="Arial" w:hAnsi="Arial"/>
-          <w:b/>
-          <w:sz w:val="22"/>
-        </w:rPr>
-        <w:t>On screen:</w:t>
-      </w:r>
-      <w:r>
-        <w:rPr>
-          <w:rFonts w:ascii="Arial" w:hAnsi="Arial"/>
-          <w:sz w:val="22"/>
-        </w:rPr>
-        <w:t xml:space="preserve"> </w:t>
-      </w:r>
-      <w:r>
-        <w:rPr>
-          <w:rFonts w:ascii="Courier New" w:hAnsi="Courier New"/>
-          <w:color w:val="172523"/>
-          <w:sz w:val="19"/>
-        </w:rPr>
-        <w:t>Same kernel. Different rig.json. Observe first.</w:t>
+        <w:t>That is how this grows. Not by giving the model more authority, but by letting more benches plug the same safety kernel into the buses they already have.</w:t>
       </w:r>
     </w:p>
     <w:p>
@@ -987,7 +915,7 @@
         <w:pStyle w:val="Heading1"/>
       </w:pPr>
       <w:r>
-        <w:t>4:20 to 5:40 — Why this AI, the benchmark, and the fallback</w:t>
+        <w:t>4:20–5:40  Why this AI</w:t>
       </w:r>
     </w:p>
     <w:p>
@@ -1019,7 +947,7 @@
           <w:rFonts w:ascii="Arial" w:hAnsi="Arial"/>
           <w:sz w:val="22"/>
         </w:rPr>
-        <w:t xml:space="preserve">. Hold on each of the three columns as it is named. End on </w:t>
+        <w:t xml:space="preserve">, then </w:t>
       </w:r>
       <w:r>
         <w:rPr>
@@ -1029,13 +957,6 @@
         </w:rPr>
         <w:t>stills/07_ai_benchmark.png</w:t>
       </w:r>
-      <w:r>
-        <w:rPr>
-          <w:rFonts w:ascii="Arial" w:hAnsi="Arial"/>
-          <w:sz w:val="22"/>
-        </w:rPr>
-        <w:t>.</w:t>
-      </w:r>
     </w:p>
     <w:p>
       <w:r>
@@ -1044,7 +965,7 @@
           <w:b/>
           <w:sz w:val="22"/>
         </w:rPr>
-        <w:t>Narration:</w:t>
+        <w:t>Say this:</w:t>
       </w:r>
     </w:p>
     <w:p>
@@ -1126,47 +1047,14 @@
           <w:b/>
           <w:sz w:val="22"/>
         </w:rPr>
-        <w:t>On screen:</w:t>
+        <w:t>Keep these facts:</w:t>
       </w:r>
       <w:r>
         <w:rPr>
           <w:rFonts w:ascii="Arial" w:hAnsi="Arial"/>
           <w:sz w:val="22"/>
         </w:rPr>
-        <w:t xml:space="preserve"> </w:t>
-      </w:r>
-      <w:r>
-        <w:rPr>
-          <w:rFonts w:ascii="Courier New" w:hAnsi="Courier New"/>
-          <w:color w:val="172523"/>
-          <w:sz w:val="19"/>
-        </w:rPr>
-        <w:t>Build-time: Grok 4.6. Runtime default: Fake. Live fallbacks: Claude, then OpenAI.</w:t>
-      </w:r>
-    </w:p>
-    <w:p>
-      <w:r>
-        <w:rPr>
-          <w:rFonts w:ascii="Arial" w:hAnsi="Arial"/>
-          <w:b/>
-          <w:sz w:val="22"/>
-        </w:rPr>
-        <w:t>Second card:</w:t>
-      </w:r>
-      <w:r>
-        <w:rPr>
-          <w:rFonts w:ascii="Arial" w:hAnsi="Arial"/>
-          <w:sz w:val="22"/>
-        </w:rPr>
-        <w:t xml:space="preserve"> </w:t>
-      </w:r>
-      <w:r>
-        <w:rPr>
-          <w:rFonts w:ascii="Courier New" w:hAnsi="Courier New"/>
-          <w:color w:val="172523"/>
-          <w:sz w:val="19"/>
-        </w:rPr>
-        <w:t>Benchmark: skill routing and tool discipline. Not chat quality.</w:t>
+        <w:t xml:space="preserve"> Fake ran the 12 Sep hardware. Live Claude/OpenAI are adapters, not the proven bench path.</w:t>
       </w:r>
     </w:p>
     <w:p>
@@ -1183,7 +1071,7 @@
         <w:pStyle w:val="Heading1"/>
       </w:pPr>
       <w:r>
-        <w:t>5:40 to 7:00 — How Phase 3 actually proved it</w:t>
+        <w:t>5:40–7:00  What Phase 3 actually proved</w:t>
       </w:r>
     </w:p>
     <w:p>
@@ -1215,7 +1103,7 @@
           <w:rFonts w:ascii="Arial" w:hAnsi="Arial"/>
           <w:sz w:val="22"/>
         </w:rPr>
-        <w:t xml:space="preserve">, then overhead bench B-roll if you have it, then </w:t>
+        <w:t xml:space="preserve">, then </w:t>
       </w:r>
       <w:r>
         <w:rPr>
@@ -1245,22 +1133,7 @@
           <w:rFonts w:ascii="Arial" w:hAnsi="Arial"/>
           <w:sz w:val="22"/>
         </w:rPr>
-        <w:t xml:space="preserve">. Optional insert: </w:t>
-      </w:r>
-      <w:r>
-        <w:rPr>
-          <w:rFonts w:ascii="Courier New" w:hAnsi="Courier New"/>
-          <w:color w:val="172523"/>
-          <w:sz w:val="19"/>
-        </w:rPr>
-        <w:t>../assets/05_kernel_event_timeline.png</w:t>
-      </w:r>
-      <w:r>
-        <w:rPr>
-          <w:rFonts w:ascii="Arial" w:hAnsi="Arial"/>
-          <w:sz w:val="22"/>
-        </w:rPr>
-        <w:t>.</w:t>
+        <w:t xml:space="preserve"> (reveal one term at a time).</w:t>
       </w:r>
     </w:p>
     <w:p>
@@ -1270,7 +1143,7 @@
           <w:b/>
           <w:sz w:val="22"/>
         </w:rPr>
-        <w:t>Narration:</w:t>
+        <w:t>Say this:</w:t>
       </w:r>
     </w:p>
     <w:p>
@@ -1370,47 +1243,14 @@
           <w:b/>
           <w:sz w:val="22"/>
         </w:rPr>
-        <w:t>On screen:</w:t>
+        <w:t>Keep these facts:</w:t>
       </w:r>
       <w:r>
         <w:rPr>
           <w:rFonts w:ascii="Arial" w:hAnsi="Arial"/>
           <w:sz w:val="22"/>
         </w:rPr>
-        <w:t xml:space="preserve"> </w:t>
-      </w:r>
-      <w:r>
-        <w:rPr>
-          <w:rFonts w:ascii="Courier New" w:hAnsi="Courier New"/>
-          <w:color w:val="172523"/>
-          <w:sz w:val="19"/>
-        </w:rPr>
-        <w:t>Observe, simulate, arm, run, restore.</w:t>
-      </w:r>
-    </w:p>
-    <w:p>
-      <w:r>
-        <w:rPr>
-          <w:rFonts w:ascii="Arial" w:hAnsi="Arial"/>
-          <w:b/>
-          <w:sz w:val="22"/>
-        </w:rPr>
-        <w:t>Equation card:</w:t>
-      </w:r>
-      <w:r>
-        <w:rPr>
-          <w:rFonts w:ascii="Arial" w:hAnsi="Arial"/>
-          <w:sz w:val="22"/>
-        </w:rPr>
-        <w:t xml:space="preserve"> </w:t>
-      </w:r>
-      <w:r>
-        <w:rPr>
-          <w:rFonts w:ascii="Courier New" w:hAnsi="Courier New"/>
-          <w:color w:val="172523"/>
-          <w:sz w:val="19"/>
-        </w:rPr>
-        <w:t>OUTPUT = enabled AND permit AND not tripped AND E-stop closed AND healthy</w:t>
+        <w:t xml:space="preserve"> 3,422 samples, 34/34 checks, 4.83 bar, 15.41 L/min, first ADC sweep failed and was kept.</w:t>
       </w:r>
     </w:p>
     <w:p>
@@ -1427,7 +1267,7 @@
         <w:pStyle w:val="Heading1"/>
       </w:pPr>
       <w:r>
-        <w:t>7:00 to 7:45 — Phase 3 dashboard, observe only</w:t>
+        <w:t>7:00–7:45  Phase 3 dashboard (course PoC)</w:t>
       </w:r>
     </w:p>
     <w:p>
@@ -1444,7 +1284,30 @@
           <w:rFonts w:ascii="Arial" w:hAnsi="Arial"/>
           <w:sz w:val="22"/>
         </w:rPr>
-        <w:t xml:space="preserve"> Screen recording of the frozen Phase 3 live dashboard on port 8080. Label the whole clip. Do not click arm. Optional cutaway of the physical bench sitting idle.</w:t>
+        <w:t xml:space="preserve"> your </w:t>
+      </w:r>
+      <w:r>
+        <w:rPr>
+          <w:rFonts w:ascii="Courier New" w:hAnsi="Courier New"/>
+          <w:color w:val="172523"/>
+          <w:sz w:val="19"/>
+        </w:rPr>
+        <w:t>P3_dashboard_8080.mp4</w:t>
+      </w:r>
+      <w:r>
+        <w:rPr>
+          <w:rFonts w:ascii="Arial" w:hAnsi="Arial"/>
+          <w:sz w:val="22"/>
+        </w:rPr>
+        <w:t xml:space="preserve">. Overlay: </w:t>
+      </w:r>
+      <w:r>
+        <w:rPr>
+          <w:rFonts w:ascii="Courier New" w:hAnsi="Courier New"/>
+          <w:color w:val="172523"/>
+          <w:sz w:val="19"/>
+        </w:rPr>
+        <w:t>Phase 3 dashboard · port 8080 · observe only</w:t>
       </w:r>
     </w:p>
     <w:p>
@@ -1454,7 +1317,7 @@
           <w:b/>
           <w:sz w:val="22"/>
         </w:rPr>
-        <w:t>Narration:</w:t>
+        <w:t>Say this:</w:t>
       </w:r>
     </w:p>
     <w:p>
@@ -1472,7 +1335,7 @@
           <w:rFonts w:ascii="Arial" w:hAnsi="Arial"/>
           <w:sz w:val="22"/>
         </w:rPr>
-        <w:t>It is not the product we will take into capstone. It is the evidence that the low-voltage bench, the analog paths, the emergency stop, and the relay changeover already worked as a course submission.</w:t>
+        <w:t>This is not the capstone product. It is the evidence that the low-voltage bench already worked.</w:t>
       </w:r>
     </w:p>
     <w:p>
@@ -1482,31 +1345,6 @@
           <w:sz w:val="22"/>
         </w:rPr>
         <w:t>Watch the meters. Do not arm anything here.</w:t>
-      </w:r>
-    </w:p>
-    <w:p>
-      <w:r>
-        <w:rPr>
-          <w:rFonts w:ascii="Arial" w:hAnsi="Arial"/>
-          <w:b/>
-          <w:sz w:val="22"/>
-        </w:rPr>
-        <w:t>On screen, full clip:</w:t>
-      </w:r>
-      <w:r>
-        <w:rPr>
-          <w:rFonts w:ascii="Arial" w:hAnsi="Arial"/>
-          <w:sz w:val="22"/>
-        </w:rPr>
-        <w:t xml:space="preserve"> </w:t>
-      </w:r>
-      <w:r>
-        <w:rPr>
-          <w:rFonts w:ascii="Courier New" w:hAnsi="Courier New"/>
-          <w:color w:val="172523"/>
-          <w:sz w:val="19"/>
-        </w:rPr>
-        <w:t>Phase 3 dashboard · port 8080 · observe only</w:t>
       </w:r>
     </w:p>
     <w:p>
@@ -1523,7 +1361,7 @@
         <w:pStyle w:val="Heading1"/>
       </w:pPr>
       <w:r>
-        <w:t>7:45 to 11:00 — Stitch the product demo</w:t>
+        <w:t>7:45–11:00  Studio demo (stitch your recording)</w:t>
       </w:r>
     </w:p>
     <w:p>
@@ -1540,24 +1378,37 @@
           <w:rFonts w:ascii="Arial" w:hAnsi="Arial"/>
           <w:sz w:val="22"/>
         </w:rPr>
-        <w:t xml:space="preserve"> Screen recording of Studio against the simulator, or against the sidecar on port 8081 if the Pi is already up. Follow the capture checklist. Overlay the surface label for the first five seconds of each scene.</w:t>
+        <w:t xml:space="preserve"> your Studio clips. Overlay </w:t>
       </w:r>
-    </w:p>
-    <w:p>
+      <w:r>
+        <w:rPr>
+          <w:rFonts w:ascii="Courier New" w:hAnsi="Courier New"/>
+          <w:color w:val="172523"/>
+          <w:sz w:val="19"/>
+        </w:rPr>
+        <w:t>Studio · simulator</w:t>
+      </w:r>
       <w:r>
         <w:rPr>
           <w:rFonts w:ascii="Arial" w:hAnsi="Arial"/>
           <w:sz w:val="22"/>
         </w:rPr>
-        <w:t>Hold on the click. Do not talk over a trip crossing; let the graph and the kernel event speak, then resume.</w:t>
+        <w:t xml:space="preserve"> or </w:t>
       </w:r>
-    </w:p>
-    <w:p>
-      <w:pPr>
-        <w:pStyle w:val="Heading2"/>
-      </w:pPr>
       <w:r>
-        <w:t>7:45 — Live</w:t>
+        <w:rPr>
+          <w:rFonts w:ascii="Courier New" w:hAnsi="Courier New"/>
+          <w:color w:val="172523"/>
+          <w:sz w:val="19"/>
+        </w:rPr>
+        <w:t>Studio · Raspberry Pi sidecar :8081</w:t>
+      </w:r>
+      <w:r>
+        <w:rPr>
+          <w:rFonts w:ascii="Arial" w:hAnsi="Arial"/>
+          <w:sz w:val="22"/>
+        </w:rPr>
+        <w:t>. Hold on clicks. Do not talk over the trip.</w:t>
       </w:r>
     </w:p>
     <w:p>
@@ -1567,7 +1418,7 @@
           <w:b/>
           <w:sz w:val="22"/>
         </w:rPr>
-        <w:t>Narration:</w:t>
+        <w:t>Say this:</w:t>
       </w:r>
     </w:p>
     <w:p>
@@ -1592,79 +1443,6 @@
       <w:r>
         <w:rPr>
           <w:rFonts w:ascii="Arial" w:hAnsi="Arial"/>
-          <w:b/>
-          <w:sz w:val="22"/>
-        </w:rPr>
-        <w:t>On screen:</w:t>
-      </w:r>
-      <w:r>
-        <w:rPr>
-          <w:rFonts w:ascii="Arial" w:hAnsi="Arial"/>
-          <w:sz w:val="22"/>
-        </w:rPr>
-        <w:t xml:space="preserve"> </w:t>
-      </w:r>
-      <w:r>
-        <w:rPr>
-          <w:rFonts w:ascii="Courier New" w:hAnsi="Courier New"/>
-          <w:color w:val="172523"/>
-          <w:sz w:val="19"/>
-        </w:rPr>
-        <w:t>Studio · Live</w:t>
-      </w:r>
-      <w:r>
-        <w:rPr>
-          <w:rFonts w:ascii="Arial" w:hAnsi="Arial"/>
-          <w:sz w:val="22"/>
-        </w:rPr>
-        <w:t xml:space="preserve"> and either </w:t>
-      </w:r>
-      <w:r>
-        <w:rPr>
-          <w:rFonts w:ascii="Courier New" w:hAnsi="Courier New"/>
-          <w:color w:val="172523"/>
-          <w:sz w:val="19"/>
-        </w:rPr>
-        <w:t>simulator</w:t>
-      </w:r>
-      <w:r>
-        <w:rPr>
-          <w:rFonts w:ascii="Arial" w:hAnsi="Arial"/>
-          <w:sz w:val="22"/>
-        </w:rPr>
-        <w:t xml:space="preserve"> or </w:t>
-      </w:r>
-      <w:r>
-        <w:rPr>
-          <w:rFonts w:ascii="Courier New" w:hAnsi="Courier New"/>
-          <w:color w:val="172523"/>
-          <w:sz w:val="19"/>
-        </w:rPr>
-        <w:t>Raspberry Pi sidecar :8081</w:t>
-      </w:r>
-    </w:p>
-    <w:p>
-      <w:pPr>
-        <w:pStyle w:val="Heading2"/>
-      </w:pPr>
-      <w:r>
-        <w:t>8:15 — Onboard and Author, in passing</w:t>
-      </w:r>
-    </w:p>
-    <w:p>
-      <w:r>
-        <w:rPr>
-          <w:rFonts w:ascii="Arial" w:hAnsi="Arial"/>
-          <w:b/>
-          <w:sz w:val="22"/>
-        </w:rPr>
-        <w:t>Narration:</w:t>
-      </w:r>
-    </w:p>
-    <w:p>
-      <w:r>
-        <w:rPr>
-          <w:rFonts w:ascii="Arial" w:hAnsi="Arial"/>
           <w:sz w:val="22"/>
         </w:rPr>
         <w:t>Onboard is where a human reviews a proposed map. The agent may suggest. The human applies.</w:t>
@@ -1677,24 +1455,6 @@
           <w:sz w:val="22"/>
         </w:rPr>
         <w:t>Author is for procedures. We are not inventing a skill on a live output.</w:t>
-      </w:r>
-    </w:p>
-    <w:p>
-      <w:pPr>
-        <w:pStyle w:val="Heading2"/>
-      </w:pPr>
-      <w:r>
-        <w:t>8:35 — Procedures and Agent</w:t>
-      </w:r>
-    </w:p>
-    <w:p>
-      <w:r>
-        <w:rPr>
-          <w:rFonts w:ascii="Arial" w:hAnsi="Arial"/>
-          <w:b/>
-          <w:sz w:val="22"/>
-        </w:rPr>
-        <w:t>Narration:</w:t>
       </w:r>
     </w:p>
     <w:p>
@@ -1728,49 +1488,6 @@
       <w:r>
         <w:rPr>
           <w:rFonts w:ascii="Arial" w:hAnsi="Arial"/>
-          <w:b/>
-          <w:sz w:val="22"/>
-        </w:rPr>
-        <w:t>On screen:</w:t>
-      </w:r>
-      <w:r>
-        <w:rPr>
-          <w:rFonts w:ascii="Arial" w:hAnsi="Arial"/>
-          <w:sz w:val="22"/>
-        </w:rPr>
-        <w:t xml:space="preserve"> </w:t>
-      </w:r>
-      <w:r>
-        <w:rPr>
-          <w:rFonts w:ascii="Courier New" w:hAnsi="Courier New"/>
-          <w:color w:val="172523"/>
-          <w:sz w:val="19"/>
-        </w:rPr>
-        <w:t>Fake agent selects the skill. Kernel compares the number.</w:t>
-      </w:r>
-    </w:p>
-    <w:p>
-      <w:pPr>
-        <w:pStyle w:val="Heading2"/>
-      </w:pPr>
-      <w:r>
-        <w:t>9:10 — Pressure trip</w:t>
-      </w:r>
-    </w:p>
-    <w:p>
-      <w:r>
-        <w:rPr>
-          <w:rFonts w:ascii="Arial" w:hAnsi="Arial"/>
-          <w:b/>
-          <w:sz w:val="22"/>
-        </w:rPr>
-        <w:t>Narration:</w:t>
-      </w:r>
-    </w:p>
-    <w:p>
-      <w:r>
-        <w:rPr>
-          <w:rFonts w:ascii="Arial" w:hAnsi="Arial"/>
           <w:sz w:val="22"/>
         </w:rPr>
         <w:t>Raise the pressure emulator. When the kernel sees the crossing, the commanded output goes safe and stays latched.</w:t>
@@ -1789,49 +1506,6 @@
       <w:r>
         <w:rPr>
           <w:rFonts w:ascii="Arial" w:hAnsi="Arial"/>
-          <w:b/>
-          <w:sz w:val="22"/>
-        </w:rPr>
-        <w:t>On screen at the crossing:</w:t>
-      </w:r>
-      <w:r>
-        <w:rPr>
-          <w:rFonts w:ascii="Arial" w:hAnsi="Arial"/>
-          <w:sz w:val="22"/>
-        </w:rPr>
-        <w:t xml:space="preserve"> </w:t>
-      </w:r>
-      <w:r>
-        <w:rPr>
-          <w:rFonts w:ascii="Courier New" w:hAnsi="Courier New"/>
-          <w:color w:val="172523"/>
-          <w:sz w:val="19"/>
-        </w:rPr>
-        <w:t>4.2 bar · kernel trip · output latched safe</w:t>
-      </w:r>
-    </w:p>
-    <w:p>
-      <w:pPr>
-        <w:pStyle w:val="Heading2"/>
-      </w:pPr>
-      <w:r>
-        <w:t>9:45 — Flow trip</w:t>
-      </w:r>
-    </w:p>
-    <w:p>
-      <w:r>
-        <w:rPr>
-          <w:rFonts w:ascii="Arial" w:hAnsi="Arial"/>
-          <w:b/>
-          <w:sz w:val="22"/>
-        </w:rPr>
-        <w:t>Narration:</w:t>
-      </w:r>
-    </w:p>
-    <w:p>
-      <w:r>
-        <w:rPr>
-          <w:rFonts w:ascii="Arial" w:hAnsi="Arial"/>
           <w:sz w:val="22"/>
         </w:rPr>
         <w:t>Same pattern for fifteen litres per minute. Independent trip. Same output.</w:t>
@@ -1841,95 +1515,9 @@
       <w:r>
         <w:rPr>
           <w:rFonts w:ascii="Arial" w:hAnsi="Arial"/>
-          <w:b/>
-          <w:sz w:val="22"/>
-        </w:rPr>
-        <w:t>On screen:</w:t>
-      </w:r>
-      <w:r>
-        <w:rPr>
-          <w:rFonts w:ascii="Arial" w:hAnsi="Arial"/>
-          <w:sz w:val="22"/>
-        </w:rPr>
-        <w:t xml:space="preserve"> </w:t>
-      </w:r>
-      <w:r>
-        <w:rPr>
-          <w:rFonts w:ascii="Courier New" w:hAnsi="Courier New"/>
-          <w:color w:val="172523"/>
-          <w:sz w:val="19"/>
-        </w:rPr>
-        <w:t>15 L/min · independent trip · same output</w:t>
-      </w:r>
-    </w:p>
-    <w:p>
-      <w:pPr>
-        <w:pStyle w:val="Heading2"/>
-      </w:pPr>
-      <w:r>
-        <w:t>10:15 — Shutdown approval</w:t>
-      </w:r>
-    </w:p>
-    <w:p>
-      <w:r>
-        <w:rPr>
-          <w:rFonts w:ascii="Arial" w:hAnsi="Arial"/>
-          <w:b/>
-          <w:sz w:val="22"/>
-        </w:rPr>
-        <w:t>Narration:</w:t>
-      </w:r>
-    </w:p>
-    <w:p>
-      <w:r>
-        <w:rPr>
-          <w:rFonts w:ascii="Arial" w:hAnsi="Arial"/>
           <w:sz w:val="22"/>
         </w:rPr>
         <w:t>If I ask it to shut the bench down, that is also an approval. The kernel forces safe first.</w:t>
-      </w:r>
-    </w:p>
-    <w:p>
-      <w:r>
-        <w:rPr>
-          <w:rFonts w:ascii="Arial" w:hAnsi="Arial"/>
-          <w:b/>
-          <w:sz w:val="22"/>
-        </w:rPr>
-        <w:t>On screen:</w:t>
-      </w:r>
-      <w:r>
-        <w:rPr>
-          <w:rFonts w:ascii="Arial" w:hAnsi="Arial"/>
-          <w:sz w:val="22"/>
-        </w:rPr>
-        <w:t xml:space="preserve"> </w:t>
-      </w:r>
-      <w:r>
-        <w:rPr>
-          <w:rFonts w:ascii="Courier New" w:hAnsi="Courier New"/>
-          <w:color w:val="172523"/>
-          <w:sz w:val="19"/>
-        </w:rPr>
-        <w:t>Shutdown needs a human. Kernel forces safe first.</w:t>
-      </w:r>
-    </w:p>
-    <w:p>
-      <w:pPr>
-        <w:pStyle w:val="Heading2"/>
-      </w:pPr>
-      <w:r>
-        <w:t>10:35 — Evidence</w:t>
-      </w:r>
-    </w:p>
-    <w:p>
-      <w:r>
-        <w:rPr>
-          <w:rFonts w:ascii="Arial" w:hAnsi="Arial"/>
-          <w:b/>
-          <w:sz w:val="22"/>
-        </w:rPr>
-        <w:t>Narration:</w:t>
       </w:r>
     </w:p>
     <w:p>
@@ -1954,31 +1542,6 @@
       <w:r>
         <w:rPr>
           <w:rFonts w:ascii="Arial" w:hAnsi="Arial"/>
-          <w:b/>
-          <w:sz w:val="22"/>
-        </w:rPr>
-        <w:t>On screen:</w:t>
-      </w:r>
-      <w:r>
-        <w:rPr>
-          <w:rFonts w:ascii="Arial" w:hAnsi="Arial"/>
-          <w:sz w:val="22"/>
-        </w:rPr>
-        <w:t xml:space="preserve"> </w:t>
-      </w:r>
-      <w:r>
-        <w:rPr>
-          <w:rFonts w:ascii="Courier New" w:hAnsi="Courier New"/>
-          <w:color w:val="172523"/>
-          <w:sz w:val="19"/>
-        </w:rPr>
-        <w:t>Checksummed evidence is the output of the procedure.</w:t>
-      </w:r>
-    </w:p>
-    <w:p>
-      <w:r>
-        <w:rPr>
-          <w:rFonts w:ascii="Arial" w:hAnsi="Arial"/>
           <w:sz w:val="22"/>
         </w:rPr>
         <w:t>---</w:t>
@@ -1989,7 +1552,7 @@
         <w:pStyle w:val="Heading1"/>
       </w:pPr>
       <w:r>
-        <w:t>11:00 to 11:40 — Future missions in the capstone</w:t>
+        <w:t>11:00–11:50  Capstone: any rig, short interview</w:t>
       </w:r>
     </w:p>
     <w:p>
@@ -2014,14 +1577,14 @@
           <w:color w:val="172523"/>
           <w:sz w:val="19"/>
         </w:rPr>
-        <w:t>stills/09_mission_1.png</w:t>
+        <w:t>stills/09_any_rig.png</w:t>
       </w:r>
       <w:r>
         <w:rPr>
           <w:rFonts w:ascii="Arial" w:hAnsi="Arial"/>
           <w:sz w:val="22"/>
         </w:rPr>
-        <w:t xml:space="preserve"> through </w:t>
+        <w:t xml:space="preserve"> → </w:t>
       </w:r>
       <w:r>
         <w:rPr>
@@ -2029,14 +1592,14 @@
           <w:color w:val="172523"/>
           <w:sz w:val="19"/>
         </w:rPr>
-        <w:t>stills/12_mission_4.png</w:t>
+        <w:t>stills/10_interview.png</w:t>
       </w:r>
       <w:r>
         <w:rPr>
           <w:rFonts w:ascii="Arial" w:hAnsi="Arial"/>
           <w:sz w:val="22"/>
         </w:rPr>
-        <w:t xml:space="preserve">, four seconds each, then </w:t>
+        <w:t xml:space="preserve"> → </w:t>
       </w:r>
       <w:r>
         <w:rPr>
@@ -2044,14 +1607,31 @@
           <w:color w:val="172523"/>
           <w:sz w:val="19"/>
         </w:rPr>
-        <w:t>stills/13_missions_summary.png</w:t>
+        <w:t>stills/11_map_locked.png</w:t>
       </w:r>
       <w:r>
         <w:rPr>
           <w:rFonts w:ascii="Arial" w:hAnsi="Arial"/>
           <w:sz w:val="22"/>
         </w:rPr>
-        <w:t>.</w:t>
+        <w:t xml:space="preserve"> → </w:t>
+      </w:r>
+      <w:r>
+        <w:rPr>
+          <w:rFonts w:ascii="Courier New" w:hAnsi="Courier New"/>
+          <w:color w:val="172523"/>
+          <w:sz w:val="19"/>
+        </w:rPr>
+        <w:t>stills/13_capstone_loop.png</w:t>
+      </w:r>
+    </w:p>
+    <w:p>
+      <w:r>
+        <w:rPr>
+          <w:rFonts w:ascii="Arial" w:hAnsi="Arial"/>
+          <w:sz w:val="22"/>
+        </w:rPr>
+        <w:t>This is the capstone. Not a hydraulic machine. Not “AI discovers an unknown plant from a photo and drives it.”</w:t>
       </w:r>
     </w:p>
     <w:p>
@@ -2061,7 +1641,7 @@
           <w:b/>
           <w:sz w:val="22"/>
         </w:rPr>
-        <w:t>Narration:</w:t>
+        <w:t>Say this:</w:t>
       </w:r>
     </w:p>
     <w:p>
@@ -2070,7 +1650,7 @@
           <w:rFonts w:ascii="Arial" w:hAnsi="Arial"/>
           <w:sz w:val="22"/>
         </w:rPr>
-        <w:t>Phase 3 ends with a mapped dry bench and a kernel that kept authority. Capstone is four missions.</w:t>
+        <w:t>Phase 3 proved the kernel on one mapped dry bench. That is the foundation. It is not the capstone.</w:t>
       </w:r>
     </w:p>
     <w:p>
@@ -2079,7 +1659,7 @@
           <w:rFonts w:ascii="Arial" w:hAnsi="Arial"/>
           <w:sz w:val="22"/>
         </w:rPr>
-        <w:t>One. A thin commissioning interview. The agent asks what modules and buses exist. A human still applies the map.</w:t>
+        <w:t>The capstone is an agentic system you can deploy onto someone else’s test rig.</w:t>
       </w:r>
     </w:p>
     <w:p>
@@ -2088,7 +1668,7 @@
           <w:rFonts w:ascii="Arial" w:hAnsi="Arial"/>
           <w:sz w:val="22"/>
         </w:rPr>
-        <w:t>Two. Prove that interview on a second simulated plant, a thermal process, before touching another physical output.</w:t>
+        <w:t>They install it on their machine. A Pi. An industrial PC. A laptop talking to their controller.</w:t>
       </w:r>
     </w:p>
     <w:p>
@@ -2097,7 +1677,7 @@
           <w:rFonts w:ascii="Arial" w:hAnsi="Arial"/>
           <w:sz w:val="22"/>
         </w:rPr>
-        <w:t>Three. Add isolated relay feedback or current sensing, so we measure the electrical response, not only the GPIO command.</w:t>
+        <w:t>Then the agent runs a short commissioning interview. What modules are here? Which bus? GPIO and an analog converter, or MQTT, Modbus, OPC UA, Siemens S7, EtherNet/IP, CAN? Which pin, register, or tag is pressure? Which is flow? What are the trip numbers and units? What must stay observe-only?</w:t>
       </w:r>
     </w:p>
     <w:p>
@@ -2106,7 +1686,16 @@
           <w:rFonts w:ascii="Arial" w:hAnsi="Arial"/>
           <w:sz w:val="22"/>
         </w:rPr>
-        <w:t>Four. Take the same kernel to a live plant bus, and only then to a hydraulic capstone. Containment, pumps, water, mains. Those are not proven today.</w:t>
+        <w:t>The agent proposes a map. A human still has to apply it. The digital twin rehearses the exact procedure. Only then can anyone arm an output.</w:t>
+      </w:r>
+    </w:p>
+    <w:p>
+      <w:r>
+        <w:rPr>
+          <w:rFonts w:ascii="Arial" w:hAnsi="Arial"/>
+          <w:sz w:val="22"/>
+        </w:rPr>
+        <w:t>We have not built that interview yet. Onboard today is a form, not discovery. Capstone is where the interview becomes the product, without ever giving the model the dangerous decision.</w:t>
       </w:r>
     </w:p>
     <w:p>
@@ -2116,22 +1705,14 @@
           <w:b/>
           <w:sz w:val="22"/>
         </w:rPr>
-        <w:t>On screen:</w:t>
+        <w:t>Keep these facts:</w:t>
       </w:r>
       <w:r>
         <w:rPr>
           <w:rFonts w:ascii="Arial" w:hAnsi="Arial"/>
           <w:sz w:val="22"/>
         </w:rPr>
-        <w:t xml:space="preserve"> </w:t>
-      </w:r>
-      <w:r>
-        <w:rPr>
-          <w:rFonts w:ascii="Courier New" w:hAnsi="Courier New"/>
-          <w:color w:val="172523"/>
-          <w:sz w:val="19"/>
-        </w:rPr>
-        <w:t>Four capstone missions. Authority stays with the kernel.</w:t>
+        <w:t xml:space="preserve"> interview is design, not proven. Twin-gate + human apply + explicit arm stay required.</w:t>
       </w:r>
     </w:p>
     <w:p>
@@ -2148,7 +1729,7 @@
         <w:pStyle w:val="Heading1"/>
       </w:pPr>
       <w:r>
-        <w:t>11:40 to 12:10 — Phase 3 is complete</w:t>
+        <w:t>11:50–12:20  Close</w:t>
       </w:r>
     </w:p>
     <w:p>
@@ -2175,12 +1756,22 @@
         </w:rPr>
         <w:t>stills/14_close.png</w:t>
       </w:r>
+    </w:p>
+    <w:p>
+      <w:r>
+        <w:rPr>
+          <w:rFonts w:ascii="Arial" w:hAnsi="Arial"/>
+          <w:b/>
+          <w:sz w:val="22"/>
+        </w:rPr>
+        <w:t>Optional:</w:t>
+      </w:r>
       <w:r>
         <w:rPr>
           <w:rFonts w:ascii="Arial" w:hAnsi="Arial"/>
           <w:sz w:val="22"/>
         </w:rPr>
-        <w:t>. Optional last frame: existing recorded red-to-green-to-red if you already have it. Do not recreate an energized sequence solely for this edit.</w:t>
+        <w:t xml:space="preserve"> you on camera for the last two sentences.</w:t>
       </w:r>
     </w:p>
     <w:p>
@@ -2190,7 +1781,7 @@
           <w:b/>
           <w:sz w:val="22"/>
         </w:rPr>
-        <w:t>Narration:</w:t>
+        <w:t>Say this:</w:t>
       </w:r>
     </w:p>
     <w:p>
@@ -2226,7 +1817,7 @@
           <w:rFonts w:ascii="Arial" w:hAnsi="Arial"/>
           <w:sz w:val="22"/>
         </w:rPr>
-        <w:t>Phase 3 is complete. The capstone project can move.</w:t>
+        <w:t>Phase 3 is complete. The capstone is to put this on any mapped bench, starting with a short commissioning interview.</w:t>
       </w:r>
     </w:p>
     <w:p>
@@ -2234,31 +1825,6 @@
         <w:rPr>
           <w:rFonts w:ascii="Arial" w:hAnsi="Arial"/>
           <w:sz w:val="22"/>
-        </w:rPr>
-        <w:t>The AI can ask. Only the kernel can say yes.</w:t>
-      </w:r>
-    </w:p>
-    <w:p>
-      <w:r>
-        <w:rPr>
-          <w:rFonts w:ascii="Arial" w:hAnsi="Arial"/>
-          <w:b/>
-          <w:sz w:val="22"/>
-        </w:rPr>
-        <w:t>Final card:</w:t>
-      </w:r>
-      <w:r>
-        <w:rPr>
-          <w:rFonts w:ascii="Arial" w:hAnsi="Arial"/>
-          <w:sz w:val="22"/>
-        </w:rPr>
-        <w:t xml:space="preserve"> </w:t>
-      </w:r>
-      <w:r>
-        <w:rPr>
-          <w:rFonts w:ascii="Courier New" w:hAnsi="Courier New"/>
-          <w:color w:val="172523"/>
-          <w:sz w:val="19"/>
         </w:rPr>
         <w:t>The AI can ask. Only the kernel can say yes.</w:t>
       </w:r>

</xml_diff>